<commit_message>
Refine portfolio presentation and project documentation
</commit_message>
<xml_diff>
--- a/downloads/NetEase_Cloud_Music_Case_CN.docx
+++ b/downloads/NetEase_Cloud_Music_Case_CN.docx
@@ -38,7 +38,7 @@
     </w:p>
     <w:p>
       <w:r>
-        <w:t>问卷设计与结果整理、问题归类与关联分析、需求评分、竞品对比、三项功能 PRD。原始项目材料保留在本地，本案例重新整理为公开展示版。</w:t>
+        <w:t>问卷设计与结果整理、问题归类与关联分析、需求评分、竞品对比、三项功能 PRD。</w:t>
       </w:r>
     </w:p>
     <w:p>
@@ -347,7 +347,7 @@
     </w:p>
     <w:p>
       <w:r>
-        <w:t>分类关联采用 3,000 次置换检验，报告 Cramer’s V；评分与意愿的组间差异报告 epsilon²。对 34 项检验使用 Benjamini–Hochberg FDR 校正。公开版仅呈现汇总结果。</w:t>
+        <w:t>分类关联采用 3,000 次置换检验，报告 Cramer’s V；评分与意愿的组间差异报告 epsilon²。对 34 项检验使用 Benjamini–Hochberg FDR 校正。</w:t>
       </w:r>
     </w:p>
     <w:p>
@@ -1261,7 +1261,7 @@
     </w:p>
     <w:p>
       <w:r>
-        <w:t>用户研究汇总、需求分析与优先级矩阵、QQ 音乐 / Spotify 竞品分析、完整版 PRD；补充本次整理的中英文案例与六组可视化概念原型。</w:t>
+        <w:t>用户研究汇总、需求分析与优先级矩阵、QQ 音乐 / Spotify 竞品分析、完整版 PRD；中英文案例与六组可视化概念原型。</w:t>
       </w:r>
     </w:p>
     <w:p>
@@ -1295,12 +1295,12 @@
         <w:pStyle w:val="Heading2"/>
       </w:pPr>
       <w:r>
-        <w:t>公开展示边界</w:t>
+        <w:t>项目性质</w:t>
       </w:r>
     </w:p>
     <w:p>
       <w:r>
-        <w:t>公开仓库保留汇总数据与产品文档；逐人问卷、联系方式、私人证明材料和过程缓存留在本地。项目为个人产品分析练习，使用网易云音乐作为研究对象。</w:t>
+        <w:t>个人产品研究项目，以网易云音乐手机端为研究对象。交付内容包括用户研究、需求分析、竞品分析、功能方案和概念原型。</w:t>
       </w:r>
     </w:p>
     <w:p>

</xml_diff>